<commit_message>
fix: remove redundant prisma.config.ts that conflicts with Docker
</commit_message>
<xml_diff>
--- a/INTRUCCIONES Y INFO/VOKTER error.docx
+++ b/INTRUCCIONES Y INFO/VOKTER error.docx
@@ -10,7 +10,7 @@
         <w:rPr>
           <w:rtl w:val="0"/>
         </w:rPr>
-        <w:t xml:space="preserve">Runtime Error</w:t>
+        <w:t xml:space="preserve">Build Failed: build daemon returned an error &lt; failed to solve: failed to compute cache key: failed to calculate checksum of ref z9sadped4glslqbd20tbmmyjg::xk7h2bmcp43h2f2tf1sp9mbdz: "/app/.env": not found &gt;</w:t>
       </w:r>
     </w:p>
     <w:p>
@@ -21,185 +21,7 @@
         <w:rPr>
           <w:rtl w:val="0"/>
         </w:rPr>
-        <w:t xml:space="preserve">Base UI: MenuGroupRootContext is missing. Menu group parts must be used within &lt;Menu.Group&gt;.</w:t>
-      </w:r>
-    </w:p>
-    <w:p>
-      <w:pPr>
-        <w:spacing w:after="240" w:before="240" w:lineRule="auto"/>
-        <w:rPr/>
-      </w:pPr>
-      <w:r>
-        <w:rPr>
-          <w:rtl w:val="0"/>
-        </w:rPr>
-        <w:t xml:space="preserve">src/components/ui/dropdown-menu.tsx (64:5) @ DropdownMenuLabel</w:t>
-      </w:r>
-    </w:p>
-    <w:p>
-      <w:pPr>
-        <w:rPr/>
-      </w:pPr>
-      <w:r>
-        <w:rPr>
-          <w:rtl w:val="0"/>
-        </w:rPr>
-        <w:t xml:space="preserve"> 62 | }) {</w:t>
-      </w:r>
-    </w:p>
-    <w:p>
-      <w:pPr>
-        <w:rPr/>
-      </w:pPr>
-      <w:r>
-        <w:rPr>
-          <w:rtl w:val="0"/>
-        </w:rPr>
-        <w:t xml:space="preserve"> 63 |   return (</w:t>
-      </w:r>
-    </w:p>
-    <w:p>
-      <w:pPr>
-        <w:rPr/>
-      </w:pPr>
-      <w:r>
-        <w:rPr>
-          <w:rtl w:val="0"/>
-        </w:rPr>
-        <w:t xml:space="preserve">&gt; 64 |     &lt;MenuPrimitive.GroupLabel</w:t>
-      </w:r>
-    </w:p>
-    <w:p>
-      <w:pPr>
-        <w:rPr/>
-      </w:pPr>
-      <w:r>
-        <w:rPr>
-          <w:rtl w:val="0"/>
-        </w:rPr>
-        <w:t xml:space="preserve">   |     ^</w:t>
-      </w:r>
-    </w:p>
-    <w:p>
-      <w:pPr>
-        <w:rPr/>
-      </w:pPr>
-      <w:r>
-        <w:rPr>
-          <w:rtl w:val="0"/>
-        </w:rPr>
-        <w:t xml:space="preserve"> 65 |       data-slot="dropdown-menu-label"</w:t>
-      </w:r>
-    </w:p>
-    <w:p>
-      <w:pPr>
-        <w:rPr/>
-      </w:pPr>
-      <w:r>
-        <w:rPr>
-          <w:rtl w:val="0"/>
-        </w:rPr>
-        <w:t xml:space="preserve"> 66 |       data-inset={inset}</w:t>
-      </w:r>
-    </w:p>
-    <w:p>
-      <w:pPr>
-        <w:rPr/>
-      </w:pPr>
-      <w:r>
-        <w:rPr>
-          <w:rtl w:val="0"/>
-        </w:rPr>
-        <w:t xml:space="preserve"> 67 |       className={cn(</w:t>
-      </w:r>
-    </w:p>
-    <w:p>
-      <w:pPr>
-        <w:spacing w:after="240" w:before="240" w:lineRule="auto"/>
-        <w:rPr/>
-      </w:pPr>
-      <w:r>
-        <w:rPr>
-          <w:rtl w:val="0"/>
-        </w:rPr>
-        <w:t xml:space="preserve">Call Stack 18</w:t>
-      </w:r>
-    </w:p>
-    <w:p>
-      <w:pPr>
-        <w:rPr/>
-      </w:pPr>
-      <w:r>
-        <w:rPr>
-          <w:rtl w:val="0"/>
-        </w:rPr>
-        <w:t xml:space="preserve">Show 15 ignore-listed frame(s)</w:t>
-      </w:r>
-    </w:p>
-    <w:p>
-      <w:pPr>
-        <w:rPr/>
-      </w:pPr>
-      <w:r>
-        <w:rPr>
-          <w:rtl w:val="0"/>
-        </w:rPr>
-        <w:t xml:space="preserve">DropdownMenuLabel</w:t>
-      </w:r>
-    </w:p>
-    <w:p>
-      <w:pPr>
-        <w:rPr/>
-      </w:pPr>
-      <w:r>
-        <w:rPr>
-          <w:rtl w:val="0"/>
-        </w:rPr>
-        <w:t xml:space="preserve">src/components/ui/dropdown-menu.tsx (64:5)</w:t>
-      </w:r>
-    </w:p>
-    <w:p>
-      <w:pPr>
-        <w:rPr/>
-      </w:pPr>
-      <w:r>
-        <w:rPr>
-          <w:rtl w:val="0"/>
-        </w:rPr>
-        <w:t xml:space="preserve">Navbar</w:t>
-      </w:r>
-    </w:p>
-    <w:p>
-      <w:pPr>
-        <w:rPr/>
-      </w:pPr>
-      <w:r>
-        <w:rPr>
-          <w:rtl w:val="0"/>
-        </w:rPr>
-        <w:t xml:space="preserve">src/components/navbar/navbar.tsx (98:17)</w:t>
-      </w:r>
-    </w:p>
-    <w:p>
-      <w:pPr>
-        <w:rPr/>
-      </w:pPr>
-      <w:r>
-        <w:rPr>
-          <w:rtl w:val="0"/>
-        </w:rPr>
-        <w:t xml:space="preserve">PublicLayout</w:t>
-      </w:r>
-    </w:p>
-    <w:p>
-      <w:pPr>
-        <w:rPr/>
-      </w:pPr>
-      <w:r>
-        <w:rPr>
-          <w:rtl w:val="0"/>
-        </w:rPr>
-        <w:t xml:space="preserve">src/app/(public)/layout.tsx (11:7)</w:t>
+        <w:t xml:space="preserve">Remove the `COPY --from=build /app/.env ./` line from `backend/Dockerfile` to fix the build. The build fails because the Dockerfile tries to copy a `.env` file that is gitignored and never present in the build context. Railway injects environment variables at runtime automatically, so no `.env` file needs to be baked into the image.</w:t>
       </w:r>
     </w:p>
     <w:p>

</xml_diff>

<commit_message>
Mejorar búsqueda con sinónimos, fix infinite loop en Zustand, admin CRUD funcional
- Búsqueda inteligente con sinónimos (audífono→audio, zapato→footwear, etc.)
- Normalización de acentos en búsqueda
- Fix infinite loop: reemplazar selectores derivados por useMemo
- Store Zustand con persistencia para productos
- Admin CRUD funcional (crear/editar/eliminar productos)
- Admin dashboard usa store en vez de API
</commit_message>
<xml_diff>
--- a/INTRUCCIONES Y INFO/VOKTER error.docx
+++ b/INTRUCCIONES Y INFO/VOKTER error.docx
@@ -4,13 +4,765 @@
   <w:body>
     <w:p>
       <w:pPr>
+        <w:shd w:fill="0a0a0a" w:val="clear"/>
+        <w:spacing w:after="340" w:lineRule="auto"/>
+        <w:rPr>
+          <w:rFonts w:ascii="Courier New" w:cs="Courier New" w:eastAsia="Courier New" w:hAnsi="Courier New"/>
+          <w:color w:val="ff6369"/>
+          <w:sz w:val="18"/>
+          <w:szCs w:val="18"/>
+          <w:shd w:fill="2a1314" w:val="clear"/>
+        </w:rPr>
+      </w:pPr>
+      <w:r>
+        <w:rPr>
+          <w:rFonts w:ascii="Courier New" w:cs="Courier New" w:eastAsia="Courier New" w:hAnsi="Courier New"/>
+          <w:color w:val="ff6369"/>
+          <w:sz w:val="18"/>
+          <w:szCs w:val="18"/>
+          <w:shd w:fill="2a1314" w:val="clear"/>
+          <w:rtl w:val="0"/>
+        </w:rPr>
+        <w:t xml:space="preserve">Console Error</w:t>
+      </w:r>
+    </w:p>
+    <w:p>
+      <w:pPr>
+        <w:shd w:fill="0a0a0a" w:val="clear"/>
+        <w:spacing w:after="120" w:line="360" w:lineRule="auto"/>
+        <w:ind w:left="60" w:firstLine="0"/>
+        <w:rPr>
+          <w:color w:val="ff6369"/>
+          <w:sz w:val="24"/>
+          <w:szCs w:val="24"/>
+        </w:rPr>
+      </w:pPr>
+      <w:r>
+        <w:rPr>
+          <w:color w:val="ff6369"/>
+          <w:sz w:val="24"/>
+          <w:szCs w:val="24"/>
+          <w:rtl w:val="0"/>
+        </w:rPr>
+        <w:t xml:space="preserve">The result of getServerSnapshot should be cached to avoid an infinite loop</w:t>
+      </w:r>
+    </w:p>
+    <w:p>
+      <w:pPr>
+        <w:pBdr>
+          <w:top w:color="auto" w:space="9" w:sz="0" w:val="none"/>
+          <w:left w:color="auto" w:space="9" w:sz="0" w:val="none"/>
+          <w:bottom w:color="auto" w:space="9" w:sz="0" w:val="none"/>
+          <w:right w:color="auto" w:space="9" w:sz="0" w:val="none"/>
+          <w:between w:color="auto" w:space="9" w:sz="0" w:val="none"/>
+        </w:pBdr>
+        <w:shd w:fill="000000" w:val="clear"/>
+        <w:spacing w:after="120" w:before="120" w:line="320" w:lineRule="auto"/>
+        <w:rPr>
+          <w:rFonts w:ascii="Courier New" w:cs="Courier New" w:eastAsia="Courier New" w:hAnsi="Courier New"/>
+          <w:color w:val="ededed"/>
+          <w:sz w:val="18"/>
+          <w:szCs w:val="18"/>
+        </w:rPr>
+      </w:pPr>
+      <w:r>
+        <w:rPr>
+          <w:rFonts w:ascii="Courier New" w:cs="Courier New" w:eastAsia="Courier New" w:hAnsi="Courier New"/>
+          <w:color w:val="ededed"/>
+          <w:sz w:val="18"/>
+          <w:szCs w:val="18"/>
+          <w:rtl w:val="0"/>
+        </w:rPr>
+        <w:t xml:space="preserve">src/app/(public)/page.tsx (25:44) @ HomePage</w:t>
+      </w:r>
+    </w:p>
+    <w:p>
+      <w:pPr>
+        <w:shd w:fill="000000" w:val="clear"/>
+        <w:spacing w:after="120" w:before="120" w:line="320" w:lineRule="auto"/>
+        <w:rPr>
+          <w:rFonts w:ascii="Courier New" w:cs="Courier New" w:eastAsia="Courier New" w:hAnsi="Courier New"/>
+          <w:color w:val="a0a0a0"/>
+          <w:sz w:val="18"/>
+          <w:szCs w:val="18"/>
+        </w:rPr>
+      </w:pPr>
+      <w:r>
+        <w:rPr>
+          <w:rFonts w:ascii="Courier New" w:cs="Courier New" w:eastAsia="Courier New" w:hAnsi="Courier New"/>
+          <w:color w:val="ededed"/>
+          <w:sz w:val="18"/>
+          <w:szCs w:val="18"/>
+          <w:rtl w:val="0"/>
+        </w:rPr>
+        <w:t xml:space="preserve"> </w:t>
+      </w:r>
+      <w:r>
+        <w:rPr>
+          <w:rFonts w:ascii="Courier New" w:cs="Courier New" w:eastAsia="Courier New" w:hAnsi="Courier New"/>
+          <w:color w:val="a0a0a0"/>
+          <w:sz w:val="18"/>
+          <w:szCs w:val="18"/>
+          <w:rtl w:val="0"/>
+        </w:rPr>
+        <w:t xml:space="preserve">23 |</w:t>
+      </w:r>
+    </w:p>
+    <w:p>
+      <w:pPr>
+        <w:shd w:fill="000000" w:val="clear"/>
+        <w:spacing w:after="120" w:before="120" w:line="320" w:lineRule="auto"/>
+        <w:rPr>
+          <w:rFonts w:ascii="Courier New" w:cs="Courier New" w:eastAsia="Courier New" w:hAnsi="Courier New"/>
+          <w:color w:val="ededed"/>
+          <w:sz w:val="18"/>
+          <w:szCs w:val="18"/>
+        </w:rPr>
+      </w:pPr>
+      <w:r>
+        <w:rPr>
+          <w:rFonts w:ascii="Courier New" w:cs="Courier New" w:eastAsia="Courier New" w:hAnsi="Courier New"/>
+          <w:color w:val="ededed"/>
+          <w:sz w:val="18"/>
+          <w:szCs w:val="18"/>
+          <w:rtl w:val="0"/>
+        </w:rPr>
+        <w:t xml:space="preserve"> </w:t>
+      </w:r>
+      <w:r>
+        <w:rPr>
+          <w:rFonts w:ascii="Courier New" w:cs="Courier New" w:eastAsia="Courier New" w:hAnsi="Courier New"/>
+          <w:color w:val="a0a0a0"/>
+          <w:sz w:val="18"/>
+          <w:szCs w:val="18"/>
+          <w:rtl w:val="0"/>
+        </w:rPr>
+        <w:t xml:space="preserve">24 |</w:t>
+      </w:r>
+      <w:r>
+        <w:rPr>
+          <w:rFonts w:ascii="Courier New" w:cs="Courier New" w:eastAsia="Courier New" w:hAnsi="Courier New"/>
+          <w:color w:val="ededed"/>
+          <w:sz w:val="18"/>
+          <w:szCs w:val="18"/>
+          <w:rtl w:val="0"/>
+        </w:rPr>
+        <w:t xml:space="preserve"> </w:t>
+      </w:r>
+      <w:r>
+        <w:rPr>
+          <w:rFonts w:ascii="Courier New" w:cs="Courier New" w:eastAsia="Courier New" w:hAnsi="Courier New"/>
+          <w:color w:val="f76e99"/>
+          <w:sz w:val="18"/>
+          <w:szCs w:val="18"/>
+          <w:rtl w:val="0"/>
+        </w:rPr>
+        <w:t xml:space="preserve">export</w:t>
+      </w:r>
+      <w:r>
+        <w:rPr>
+          <w:rFonts w:ascii="Courier New" w:cs="Courier New" w:eastAsia="Courier New" w:hAnsi="Courier New"/>
+          <w:color w:val="ededed"/>
+          <w:sz w:val="18"/>
+          <w:szCs w:val="18"/>
+          <w:rtl w:val="0"/>
+        </w:rPr>
+        <w:t xml:space="preserve"> </w:t>
+      </w:r>
+      <w:r>
+        <w:rPr>
+          <w:rFonts w:ascii="Courier New" w:cs="Courier New" w:eastAsia="Courier New" w:hAnsi="Courier New"/>
+          <w:color w:val="f76e99"/>
+          <w:sz w:val="18"/>
+          <w:szCs w:val="18"/>
+          <w:rtl w:val="0"/>
+        </w:rPr>
+        <w:t xml:space="preserve">default</w:t>
+      </w:r>
+      <w:r>
+        <w:rPr>
+          <w:rFonts w:ascii="Courier New" w:cs="Courier New" w:eastAsia="Courier New" w:hAnsi="Courier New"/>
+          <w:color w:val="ededed"/>
+          <w:sz w:val="18"/>
+          <w:szCs w:val="18"/>
+          <w:rtl w:val="0"/>
+        </w:rPr>
+        <w:t xml:space="preserve"> </w:t>
+      </w:r>
+      <w:r>
+        <w:rPr>
+          <w:rFonts w:ascii="Courier New" w:cs="Courier New" w:eastAsia="Courier New" w:hAnsi="Courier New"/>
+          <w:color w:val="f76e99"/>
+          <w:sz w:val="18"/>
+          <w:szCs w:val="18"/>
+          <w:rtl w:val="0"/>
+        </w:rPr>
+        <w:t xml:space="preserve">function</w:t>
+      </w:r>
+      <w:r>
+        <w:rPr>
+          <w:rFonts w:ascii="Courier New" w:cs="Courier New" w:eastAsia="Courier New" w:hAnsi="Courier New"/>
+          <w:color w:val="ededed"/>
+          <w:sz w:val="18"/>
+          <w:szCs w:val="18"/>
+          <w:rtl w:val="0"/>
+        </w:rPr>
+        <w:t xml:space="preserve"> </w:t>
+      </w:r>
+      <w:r>
+        <w:rPr>
+          <w:rFonts w:ascii="Courier New" w:cs="Courier New" w:eastAsia="Courier New" w:hAnsi="Courier New"/>
+          <w:color w:val="52a9ff"/>
+          <w:sz w:val="18"/>
+          <w:szCs w:val="18"/>
+          <w:rtl w:val="0"/>
+        </w:rPr>
+        <w:t xml:space="preserve">HomePage</w:t>
+      </w:r>
+      <w:r>
+        <w:rPr>
+          <w:rFonts w:ascii="Courier New" w:cs="Courier New" w:eastAsia="Courier New" w:hAnsi="Courier New"/>
+          <w:color w:val="ededed"/>
+          <w:sz w:val="18"/>
+          <w:szCs w:val="18"/>
+          <w:rtl w:val="0"/>
+        </w:rPr>
+        <w:t xml:space="preserve">() {</w:t>
+      </w:r>
+    </w:p>
+    <w:p>
+      <w:pPr>
+        <w:shd w:fill="000000" w:val="clear"/>
+        <w:spacing w:after="120" w:before="120" w:line="320" w:lineRule="auto"/>
+        <w:rPr>
+          <w:rFonts w:ascii="Courier New" w:cs="Courier New" w:eastAsia="Courier New" w:hAnsi="Courier New"/>
+          <w:color w:val="ededed"/>
+          <w:sz w:val="18"/>
+          <w:szCs w:val="18"/>
+        </w:rPr>
+      </w:pPr>
+      <w:r>
+        <w:rPr>
+          <w:rFonts w:ascii="Courier New" w:cs="Courier New" w:eastAsia="Courier New" w:hAnsi="Courier New"/>
+          <w:color w:val="e5484d"/>
+          <w:sz w:val="18"/>
+          <w:szCs w:val="18"/>
+          <w:rtl w:val="0"/>
+        </w:rPr>
+        <w:t xml:space="preserve">&gt;</w:t>
+      </w:r>
+      <w:r>
+        <w:rPr>
+          <w:rFonts w:ascii="Courier New" w:cs="Courier New" w:eastAsia="Courier New" w:hAnsi="Courier New"/>
+          <w:color w:val="ededed"/>
+          <w:sz w:val="18"/>
+          <w:szCs w:val="18"/>
+          <w:rtl w:val="0"/>
+        </w:rPr>
+        <w:t xml:space="preserve"> </w:t>
+      </w:r>
+      <w:r>
+        <w:rPr>
+          <w:rFonts w:ascii="Courier New" w:cs="Courier New" w:eastAsia="Courier New" w:hAnsi="Courier New"/>
+          <w:color w:val="a0a0a0"/>
+          <w:sz w:val="18"/>
+          <w:szCs w:val="18"/>
+          <w:rtl w:val="0"/>
+        </w:rPr>
+        <w:t xml:space="preserve">25 |</w:t>
+      </w:r>
+      <w:r>
+        <w:rPr>
+          <w:rFonts w:ascii="Courier New" w:cs="Courier New" w:eastAsia="Courier New" w:hAnsi="Courier New"/>
+          <w:color w:val="ededed"/>
+          <w:sz w:val="18"/>
+          <w:szCs w:val="18"/>
+          <w:rtl w:val="0"/>
+        </w:rPr>
+        <w:t xml:space="preserve">   </w:t>
+      </w:r>
+      <w:r>
+        <w:rPr>
+          <w:rFonts w:ascii="Courier New" w:cs="Courier New" w:eastAsia="Courier New" w:hAnsi="Courier New"/>
+          <w:color w:val="f76e99"/>
+          <w:sz w:val="18"/>
+          <w:szCs w:val="18"/>
+          <w:rtl w:val="0"/>
+        </w:rPr>
+        <w:t xml:space="preserve">const</w:t>
+      </w:r>
+      <w:r>
+        <w:rPr>
+          <w:rFonts w:ascii="Courier New" w:cs="Courier New" w:eastAsia="Courier New" w:hAnsi="Courier New"/>
+          <w:color w:val="ededed"/>
+          <w:sz w:val="18"/>
+          <w:szCs w:val="18"/>
+          <w:rtl w:val="0"/>
+        </w:rPr>
+        <w:t xml:space="preserve"> featuredProducts = useProductsStore((s) =&gt; s.getFeaturedProducts())</w:t>
+      </w:r>
+    </w:p>
+    <w:p>
+      <w:pPr>
+        <w:shd w:fill="000000" w:val="clear"/>
+        <w:spacing w:after="120" w:before="120" w:line="320" w:lineRule="auto"/>
+        <w:rPr>
+          <w:rFonts w:ascii="Courier New" w:cs="Courier New" w:eastAsia="Courier New" w:hAnsi="Courier New"/>
+          <w:color w:val="e5484d"/>
+          <w:sz w:val="18"/>
+          <w:szCs w:val="18"/>
+        </w:rPr>
+      </w:pPr>
+      <w:r>
+        <w:rPr>
+          <w:rFonts w:ascii="Courier New" w:cs="Courier New" w:eastAsia="Courier New" w:hAnsi="Courier New"/>
+          <w:color w:val="ededed"/>
+          <w:sz w:val="18"/>
+          <w:szCs w:val="18"/>
+          <w:rtl w:val="0"/>
+        </w:rPr>
+        <w:t xml:space="preserve"> </w:t>
+      </w:r>
+      <w:r>
+        <w:rPr>
+          <w:rFonts w:ascii="Courier New" w:cs="Courier New" w:eastAsia="Courier New" w:hAnsi="Courier New"/>
+          <w:color w:val="a0a0a0"/>
+          <w:sz w:val="18"/>
+          <w:szCs w:val="18"/>
+          <w:rtl w:val="0"/>
+        </w:rPr>
+        <w:t xml:space="preserve">  |</w:t>
+      </w:r>
+      <w:r>
+        <w:rPr>
+          <w:rFonts w:ascii="Courier New" w:cs="Courier New" w:eastAsia="Courier New" w:hAnsi="Courier New"/>
+          <w:color w:val="ededed"/>
+          <w:sz w:val="18"/>
+          <w:szCs w:val="18"/>
+          <w:rtl w:val="0"/>
+        </w:rPr>
+        <w:t xml:space="preserve">                                            </w:t>
+      </w:r>
+      <w:r>
+        <w:rPr>
+          <w:rFonts w:ascii="Courier New" w:cs="Courier New" w:eastAsia="Courier New" w:hAnsi="Courier New"/>
+          <w:color w:val="e5484d"/>
+          <w:sz w:val="18"/>
+          <w:szCs w:val="18"/>
+          <w:rtl w:val="0"/>
+        </w:rPr>
+        <w:t xml:space="preserve">^</w:t>
+      </w:r>
+    </w:p>
+    <w:p>
+      <w:pPr>
+        <w:shd w:fill="000000" w:val="clear"/>
+        <w:spacing w:after="120" w:before="120" w:line="320" w:lineRule="auto"/>
+        <w:rPr>
+          <w:rFonts w:ascii="Courier New" w:cs="Courier New" w:eastAsia="Courier New" w:hAnsi="Courier New"/>
+          <w:color w:val="ededed"/>
+          <w:sz w:val="18"/>
+          <w:szCs w:val="18"/>
+        </w:rPr>
+      </w:pPr>
+      <w:r>
+        <w:rPr>
+          <w:rFonts w:ascii="Courier New" w:cs="Courier New" w:eastAsia="Courier New" w:hAnsi="Courier New"/>
+          <w:color w:val="ededed"/>
+          <w:sz w:val="18"/>
+          <w:szCs w:val="18"/>
+          <w:rtl w:val="0"/>
+        </w:rPr>
+        <w:t xml:space="preserve"> </w:t>
+      </w:r>
+      <w:r>
+        <w:rPr>
+          <w:rFonts w:ascii="Courier New" w:cs="Courier New" w:eastAsia="Courier New" w:hAnsi="Courier New"/>
+          <w:color w:val="a0a0a0"/>
+          <w:sz w:val="18"/>
+          <w:szCs w:val="18"/>
+          <w:rtl w:val="0"/>
+        </w:rPr>
+        <w:t xml:space="preserve">26 |</w:t>
+      </w:r>
+      <w:r>
+        <w:rPr>
+          <w:rFonts w:ascii="Courier New" w:cs="Courier New" w:eastAsia="Courier New" w:hAnsi="Courier New"/>
+          <w:color w:val="ededed"/>
+          <w:sz w:val="18"/>
+          <w:szCs w:val="18"/>
+          <w:rtl w:val="0"/>
+        </w:rPr>
+        <w:t xml:space="preserve">   </w:t>
+      </w:r>
+      <w:r>
+        <w:rPr>
+          <w:rFonts w:ascii="Courier New" w:cs="Courier New" w:eastAsia="Courier New" w:hAnsi="Courier New"/>
+          <w:color w:val="f76e99"/>
+          <w:sz w:val="18"/>
+          <w:szCs w:val="18"/>
+          <w:rtl w:val="0"/>
+        </w:rPr>
+        <w:t xml:space="preserve">return</w:t>
+      </w:r>
+      <w:r>
+        <w:rPr>
+          <w:rFonts w:ascii="Courier New" w:cs="Courier New" w:eastAsia="Courier New" w:hAnsi="Courier New"/>
+          <w:color w:val="ededed"/>
+          <w:sz w:val="18"/>
+          <w:szCs w:val="18"/>
+          <w:rtl w:val="0"/>
+        </w:rPr>
+        <w:t xml:space="preserve"> (</w:t>
+      </w:r>
+    </w:p>
+    <w:p>
+      <w:pPr>
+        <w:shd w:fill="000000" w:val="clear"/>
+        <w:spacing w:after="120" w:before="120" w:line="320" w:lineRule="auto"/>
+        <w:rPr>
+          <w:rFonts w:ascii="Courier New" w:cs="Courier New" w:eastAsia="Courier New" w:hAnsi="Courier New"/>
+          <w:color w:val="ededed"/>
+          <w:sz w:val="18"/>
+          <w:szCs w:val="18"/>
+        </w:rPr>
+      </w:pPr>
+      <w:r>
+        <w:rPr>
+          <w:rFonts w:ascii="Courier New" w:cs="Courier New" w:eastAsia="Courier New" w:hAnsi="Courier New"/>
+          <w:color w:val="ededed"/>
+          <w:sz w:val="18"/>
+          <w:szCs w:val="18"/>
+          <w:rtl w:val="0"/>
+        </w:rPr>
+        <w:t xml:space="preserve"> </w:t>
+      </w:r>
+      <w:r>
+        <w:rPr>
+          <w:rFonts w:ascii="Courier New" w:cs="Courier New" w:eastAsia="Courier New" w:hAnsi="Courier New"/>
+          <w:color w:val="a0a0a0"/>
+          <w:sz w:val="18"/>
+          <w:szCs w:val="18"/>
+          <w:rtl w:val="0"/>
+        </w:rPr>
+        <w:t xml:space="preserve">27 |</w:t>
+      </w:r>
+      <w:r>
+        <w:rPr>
+          <w:rFonts w:ascii="Courier New" w:cs="Courier New" w:eastAsia="Courier New" w:hAnsi="Courier New"/>
+          <w:color w:val="ededed"/>
+          <w:sz w:val="18"/>
+          <w:szCs w:val="18"/>
+          <w:rtl w:val="0"/>
+        </w:rPr>
+        <w:t xml:space="preserve">     &lt;div&gt;</w:t>
+      </w:r>
+    </w:p>
+    <w:p>
+      <w:pPr>
+        <w:shd w:fill="000000" w:val="clear"/>
+        <w:spacing w:after="120" w:before="120" w:line="320" w:lineRule="auto"/>
+        <w:rPr>
+          <w:rFonts w:ascii="Courier New" w:cs="Courier New" w:eastAsia="Courier New" w:hAnsi="Courier New"/>
+          <w:color w:val="ededed"/>
+          <w:sz w:val="18"/>
+          <w:szCs w:val="18"/>
+        </w:rPr>
+      </w:pPr>
+      <w:r>
+        <w:rPr>
+          <w:rFonts w:ascii="Courier New" w:cs="Courier New" w:eastAsia="Courier New" w:hAnsi="Courier New"/>
+          <w:color w:val="ededed"/>
+          <w:sz w:val="18"/>
+          <w:szCs w:val="18"/>
+          <w:rtl w:val="0"/>
+        </w:rPr>
+        <w:t xml:space="preserve"> </w:t>
+      </w:r>
+      <w:r>
+        <w:rPr>
+          <w:rFonts w:ascii="Courier New" w:cs="Courier New" w:eastAsia="Courier New" w:hAnsi="Courier New"/>
+          <w:color w:val="a0a0a0"/>
+          <w:sz w:val="18"/>
+          <w:szCs w:val="18"/>
+          <w:rtl w:val="0"/>
+        </w:rPr>
+        <w:t xml:space="preserve">28 |</w:t>
+      </w:r>
+      <w:r>
+        <w:rPr>
+          <w:rFonts w:ascii="Courier New" w:cs="Courier New" w:eastAsia="Courier New" w:hAnsi="Courier New"/>
+          <w:color w:val="ededed"/>
+          <w:sz w:val="18"/>
+          <w:szCs w:val="18"/>
+          <w:rtl w:val="0"/>
+        </w:rPr>
+        <w:t xml:space="preserve">       {</w:t>
+      </w:r>
+      <w:r>
+        <w:rPr>
+          <w:rFonts w:ascii="Courier New" w:cs="Courier New" w:eastAsia="Courier New" w:hAnsi="Courier New"/>
+          <w:color w:val="a0a0a0"/>
+          <w:sz w:val="18"/>
+          <w:szCs w:val="18"/>
+          <w:rtl w:val="0"/>
+        </w:rPr>
+        <w:t xml:space="preserve">/* Hero Banner */</w:t>
+      </w:r>
+      <w:r>
+        <w:rPr>
+          <w:rFonts w:ascii="Courier New" w:cs="Courier New" w:eastAsia="Courier New" w:hAnsi="Courier New"/>
+          <w:color w:val="ededed"/>
+          <w:sz w:val="18"/>
+          <w:szCs w:val="18"/>
+          <w:rtl w:val="0"/>
+        </w:rPr>
+        <w:t xml:space="preserve">}</w:t>
+      </w:r>
+    </w:p>
+    <w:p>
+      <w:pPr>
+        <w:shd w:fill="0a0a0a" w:val="clear"/>
+        <w:spacing w:before="120" w:lineRule="auto"/>
+        <w:rPr>
+          <w:color w:val="ededed"/>
+          <w:sz w:val="24"/>
+          <w:szCs w:val="24"/>
+        </w:rPr>
+      </w:pPr>
+      <w:r>
+        <w:rPr>
+          <w:color w:val="ededed"/>
+          <w:sz w:val="24"/>
+          <w:szCs w:val="24"/>
+          <w:rtl w:val="0"/>
+        </w:rPr>
+        <w:t xml:space="preserve">Call Stack</w:t>
+      </w:r>
+    </w:p>
+    <w:p>
+      <w:pPr>
+        <w:shd w:fill="0a0a0a" w:val="clear"/>
+        <w:spacing w:before="120" w:line="338.8235294117647" w:lineRule="auto"/>
+        <w:jc w:val="center"/>
+        <w:rPr>
+          <w:color w:val="ededed"/>
+          <w:sz w:val="17"/>
+          <w:szCs w:val="17"/>
+          <w:shd w:fill="292929" w:val="clear"/>
+        </w:rPr>
+      </w:pPr>
+      <w:r>
+        <w:rPr>
+          <w:color w:val="ededed"/>
+          <w:sz w:val="17"/>
+          <w:szCs w:val="17"/>
+          <w:shd w:fill="292929" w:val="clear"/>
+          <w:rtl w:val="0"/>
+        </w:rPr>
+        <w:t xml:space="preserve">21</w:t>
+      </w:r>
+    </w:p>
+    <w:p>
+      <w:pPr>
+        <w:shd w:fill="0a0a0a" w:val="clear"/>
+        <w:spacing w:before="120" w:lineRule="auto"/>
+        <w:rPr>
+          <w:color w:val="a0a0a0"/>
+          <w:sz w:val="24"/>
+          <w:szCs w:val="24"/>
+        </w:rPr>
+      </w:pPr>
+      <w:r>
+        <w:rPr>
+          <w:color w:val="a0a0a0"/>
+          <w:sz w:val="24"/>
+          <w:szCs w:val="24"/>
+          <w:rtl w:val="0"/>
+        </w:rPr>
+        <w:t xml:space="preserve">Show 20 ignore-listed frame(s)</w:t>
+      </w:r>
+    </w:p>
+    <w:p>
+      <w:pPr>
+        <w:shd w:fill="0a0a0a" w:val="clear"/>
+        <w:spacing w:after="60" w:before="120" w:line="342.85714285714283" w:lineRule="auto"/>
+        <w:rPr>
+          <w:rFonts w:ascii="Courier New" w:cs="Courier New" w:eastAsia="Courier New" w:hAnsi="Courier New"/>
+          <w:color w:val="ededed"/>
+          <w:sz w:val="21"/>
+          <w:szCs w:val="21"/>
+        </w:rPr>
+      </w:pPr>
+      <w:r>
+        <w:rPr>
+          <w:rFonts w:ascii="Courier New" w:cs="Courier New" w:eastAsia="Courier New" w:hAnsi="Courier New"/>
+          <w:color w:val="ededed"/>
+          <w:sz w:val="21"/>
+          <w:szCs w:val="21"/>
+          <w:rtl w:val="0"/>
+        </w:rPr>
+        <w:t xml:space="preserve">HomePage</w:t>
+      </w:r>
+    </w:p>
+    <w:p>
+      <w:pPr>
+        <w:shd w:fill="0a0a0a" w:val="clear"/>
+        <w:spacing w:before="120" w:lineRule="auto"/>
+        <w:rPr>
+          <w:color w:val="a0a0a0"/>
+          <w:sz w:val="21"/>
+          <w:szCs w:val="21"/>
+        </w:rPr>
+      </w:pPr>
+      <w:r>
+        <w:rPr>
+          <w:color w:val="a0a0a0"/>
+          <w:sz w:val="21"/>
+          <w:szCs w:val="21"/>
+          <w:rtl w:val="0"/>
+        </w:rPr>
+        <w:t xml:space="preserve">src/app/(public)/page.tsx (25:44)</w:t>
+      </w:r>
+    </w:p>
+    <w:p>
+      <w:pPr>
         <w:rPr/>
       </w:pPr>
       <w:r>
         <w:rPr>
           <w:rtl w:val="0"/>
         </w:rPr>
-        <w:t xml:space="preserve">2026-05-18 04:36:51.074 UTC [89] LOG:  checkpoint complete: wrote 24 buffers (0.1%), wrote 1 SLRU buffers; 0 WAL file(s) added, 0 removed, 0 recycled; write=2.416 s, sync=0.009 s, total=2.441 s; sync files=13, longest=0.007 s, average=0.001 s; distance=140 kB, estimate=532 kB; lsn=0/1DA5E68, redo lsn=0/1DA5E10</w:t>
+      </w:r>
+    </w:p>
+    <w:p>
+      <w:pPr>
+        <w:rPr/>
+      </w:pPr>
+      <w:r>
+        <w:rPr>
+          <w:rtl w:val="0"/>
+        </w:rPr>
+      </w:r>
+    </w:p>
+    <w:p>
+      <w:pPr>
+        <w:shd w:fill="0a0a0a" w:val="clear"/>
+        <w:spacing w:after="220" w:lineRule="auto"/>
+        <w:rPr>
+          <w:rFonts w:ascii="Courier New" w:cs="Courier New" w:eastAsia="Courier New" w:hAnsi="Courier New"/>
+          <w:color w:val="ff6369"/>
+          <w:sz w:val="18"/>
+          <w:szCs w:val="18"/>
+          <w:shd w:fill="2a1314" w:val="clear"/>
+        </w:rPr>
+      </w:pPr>
+      <w:r>
+        <w:rPr>
+          <w:rFonts w:ascii="Courier New" w:cs="Courier New" w:eastAsia="Courier New" w:hAnsi="Courier New"/>
+          <w:color w:val="ff6369"/>
+          <w:sz w:val="18"/>
+          <w:szCs w:val="18"/>
+          <w:shd w:fill="2a1314" w:val="clear"/>
+          <w:rtl w:val="0"/>
+        </w:rPr>
+        <w:t xml:space="preserve">Console Error</w:t>
+      </w:r>
+    </w:p>
+    <w:p>
+      <w:pPr>
+        <w:shd w:fill="0a0a0a" w:val="clear"/>
+        <w:spacing w:line="360" w:lineRule="auto"/>
+        <w:ind w:left="60" w:firstLine="0"/>
+        <w:rPr>
+          <w:color w:val="ff6369"/>
+          <w:sz w:val="24"/>
+          <w:szCs w:val="24"/>
+        </w:rPr>
+      </w:pPr>
+      <w:r>
+        <w:rPr>
+          <w:color w:val="ff6369"/>
+          <w:sz w:val="24"/>
+          <w:szCs w:val="24"/>
+          <w:rtl w:val="0"/>
+        </w:rPr>
+        <w:t xml:space="preserve">Maximum update depth exceeded. This can happen when a component calls setState inside useEffect, but useEffect either doesn't have a dependency array, or one of the dependencies changes on every render.</w:t>
+      </w:r>
+    </w:p>
+    <w:p>
+      <w:pPr>
+        <w:rPr/>
+      </w:pPr>
+      <w:r>
+        <w:rPr>
+          <w:rtl w:val="0"/>
+        </w:rPr>
+      </w:r>
+    </w:p>
+    <w:p>
+      <w:pPr>
+        <w:rPr/>
+      </w:pPr>
+      <w:r>
+        <w:rPr>
+          <w:rtl w:val="0"/>
+        </w:rPr>
+      </w:r>
+    </w:p>
+    <w:p>
+      <w:pPr>
+        <w:shd w:fill="0a0a0a" w:val="clear"/>
+        <w:spacing w:after="220" w:lineRule="auto"/>
+        <w:rPr>
+          <w:rFonts w:ascii="Courier New" w:cs="Courier New" w:eastAsia="Courier New" w:hAnsi="Courier New"/>
+          <w:color w:val="ff6369"/>
+          <w:sz w:val="18"/>
+          <w:szCs w:val="18"/>
+          <w:shd w:fill="2a1314" w:val="clear"/>
+        </w:rPr>
+      </w:pPr>
+      <w:r>
+        <w:rPr>
+          <w:rFonts w:ascii="Courier New" w:cs="Courier New" w:eastAsia="Courier New" w:hAnsi="Courier New"/>
+          <w:color w:val="ff6369"/>
+          <w:sz w:val="18"/>
+          <w:szCs w:val="18"/>
+          <w:shd w:fill="2a1314" w:val="clear"/>
+          <w:rtl w:val="0"/>
+        </w:rPr>
+        <w:t xml:space="preserve">Runtime Error</w:t>
+      </w:r>
+    </w:p>
+    <w:p>
+      <w:pPr>
+        <w:shd w:fill="0a0a0a" w:val="clear"/>
+        <w:spacing w:line="360" w:lineRule="auto"/>
+        <w:ind w:left="60" w:firstLine="0"/>
+        <w:rPr>
+          <w:color w:val="ff6369"/>
+          <w:sz w:val="24"/>
+          <w:szCs w:val="24"/>
+        </w:rPr>
+      </w:pPr>
+      <w:r>
+        <w:rPr>
+          <w:color w:val="ff6369"/>
+          <w:sz w:val="24"/>
+          <w:szCs w:val="24"/>
+          <w:rtl w:val="0"/>
+        </w:rPr>
+        <w:t xml:space="preserve">Maximum update depth exceeded. This can happen when a component repeatedly calls setState inside componentWillUpdate or componentDidUpdate. React limits the number of nested updates to prevent infinite loops.</w:t>
+      </w:r>
+    </w:p>
+    <w:p>
+      <w:pPr>
+        <w:rPr/>
+      </w:pPr>
+      <w:r>
+        <w:rPr>
+          <w:rtl w:val="0"/>
+        </w:rPr>
       </w:r>
     </w:p>
     <w:p>

</xml_diff>